<commit_message>
docs: incorporar capturas reales y validación completa del entorno
</commit_message>
<xml_diff>
--- a/docs/memoria.docx
+++ b/docs/memoria.docx
@@ -231,6 +231,14 @@
         <w:spacing w:after="200"/>
       </w:pPr>
       <w:r>
+        <w:t>Capturas del resultado</w:t>
+      </w:r>
+    </w:p>
+    <w:p>
+      <w:pPr>
+        <w:spacing w:after="200"/>
+      </w:pPr>
+      <w:r>
         <w:t>Justificación frente a XAMPP</w:t>
       </w:r>
     </w:p>
@@ -1124,7 +1132,18 @@
         <w:rPr>
           <w:sz w:val="20"/>
         </w:rPr>
-        <w:t>Estado de las evidencias: ejecución de los contenedores y captura pendientes de publicar y ejecutar el flujo. Este equipo no tiene Docker ni WSL instalados. La presencia del flujo de pruebas no equivale a una ejecución superada.</w:t>
+        <w:t>La ejecución 35780305976 de GitHub Actions terminó correctamente el 22 de septiembre de 2026. Se verificaron los tres contenedores reales en Ubuntu 24.04, PHP 8.3.33, MySQL 8.4.11, la respuesta HTTP 200, la consulta PDO, la vista móvil sin desbordamiento horizontal, el 404 para un archivo PHP inexistente, el error HTTP 503 al detener MySQL y la recuperación posterior. La validación se realizó en GitHub Actions porque el equipo local no tiene Docker ni WSL instalados.</w:t>
+      </w:r>
+    </w:p>
+    <w:p>
+      <w:pPr>
+        <w:spacing w:after="160" w:line="276" w:lineRule="auto"/>
+      </w:pPr>
+      <w:r>
+        <w:rPr>
+          <w:sz w:val="20"/>
+        </w:rPr>
+        <w:t>Registro de la ejecución: https://github.com/DLAOSA/daw-practica1-docker/actions/runs/35780305976</w:t>
       </w:r>
     </w:p>
     <w:p>
@@ -1133,51 +1152,123 @@
         <w:keepNext/>
       </w:pPr>
       <w:r>
-        <w:t>Justificación frente a XAMPP</w:t>
-      </w:r>
-    </w:p>
-    <w:p>
-      <w:pPr>
-        <w:spacing w:after="160" w:line="276" w:lineRule="auto"/>
-      </w:pPr>
-      <w:r>
-        <w:rPr>
-          <w:sz w:val="20"/>
-        </w:rPr>
-        <w:t>Separar nginx, PHP y MySQL da a cada contenedor una responsabilidad. Se puede reconstruir la imagen PHP para añadir una extensión sin reinstalar MySQL, y conservar la base de datos mediante un volumen. La definición del entorno queda versionada junto con el código y puede compartirse con otro equipo.</w:t>
-      </w:r>
-    </w:p>
-    <w:p>
-      <w:pPr>
-        <w:spacing w:after="160" w:line="276" w:lineRule="auto"/>
-      </w:pPr>
-      <w:r>
-        <w:rPr>
-          <w:sz w:val="20"/>
-        </w:rPr>
-        <w:t>XAMPP simplifica la instalación inicial mediante un paquete integrado y un panel de control. Para una prueba pequeña puede requerir menos configuración. Su configuración local, las versiones instaladas y los cambios manuales no se reproducen únicamente al clonar el código del proyecto.</w:t>
-      </w:r>
-    </w:p>
-    <w:p>
-      <w:pPr>
-        <w:spacing w:after="160" w:line="276" w:lineRule="auto"/>
-      </w:pPr>
-      <w:r>
-        <w:rPr>
-          <w:sz w:val="20"/>
-        </w:rPr>
-        <w:t>Docker tiene límites: requiere aprender puertos, redes, imágenes y volúmenes; ocupa espacio con las imágenes y consume recursos del motor. En Windows, los contenedores Linux requieren una máquina virtual, normalmente mediante WSL 2. Los montajes de archivos pueden rendir de forma diferente según el sistema. Las etiquetas de imagen también pueden recibir actualizaciones; para reproducir exactamente sus bytes sería necesario fijar sus resúmenes de contenido (digests).</w:t>
-      </w:r>
-    </w:p>
-    <w:p>
-      <w:pPr>
-        <w:spacing w:after="160" w:line="276" w:lineRule="auto"/>
-      </w:pPr>
-      <w:r>
-        <w:rPr>
-          <w:sz w:val="20"/>
-        </w:rPr>
-        <w:t>Esta arquitectura resulta adecuada para aprender la separación de responsabilidades y reproducir un entorno de desarrollo. No garantiza por sí sola seguridad ni escalabilidad de producción: serían necesarios, entre otros ajustes, credenciales gestionadas fuera del repositorio, copias de seguridad y HTTPS.</w:t>
+        <w:t>Capturas del resultado</w:t>
+      </w:r>
+    </w:p>
+    <w:p>
+      <w:pPr>
+        <w:spacing w:after="160" w:line="276" w:lineRule="auto"/>
+      </w:pPr>
+      <w:r>
+        <w:rPr>
+          <w:sz w:val="20"/>
+        </w:rPr>
+        <w:t>Captura real de Chromium con nginx, PHP-FPM y MySQL activos durante la validación:</w:t>
+      </w:r>
+    </w:p>
+    <w:p>
+      <w:r>
+        <w:drawing>
+          <wp:inline>
+            <wp:extent cx="5400000" cy="4339286"/>
+            <wp:docPr id="3" name="Picture 3"/>
+            <wp:cNvGraphicFramePr>
+              <a:graphicFrameLocks noChangeAspect="1"/>
+            </wp:cNvGraphicFramePr>
+            <a:graphic>
+              <a:graphicData uri="http://schemas.openxmlformats.org/drawingml/2006/picture">
+                <pic:pic>
+                  <pic:nvPicPr>
+                    <pic:cNvPr id="0" name="resultado.png"/>
+                    <pic:cNvPicPr/>
+                  </pic:nvPicPr>
+                  <pic:blipFill>
+                    <a:blip r:embed="rId14"/>
+                    <a:stretch>
+                      <a:fillRect/>
+                    </a:stretch>
+                  </pic:blipFill>
+                  <pic:spPr>
+                    <a:xfrm>
+                      <a:off x="0" y="0"/>
+                      <a:ext cx="5400000" cy="4339286"/>
+                    </a:xfrm>
+                    <a:prstGeom prst="rect"/>
+                  </pic:spPr>
+                </pic:pic>
+              </a:graphicData>
+            </a:graphic>
+          </wp:inline>
+        </w:drawing>
+      </w:r>
+    </w:p>
+    <w:p>
+      <w:pPr>
+        <w:spacing w:after="160" w:line="276" w:lineRule="auto"/>
+      </w:pPr>
+      <w:r>
+        <w:rPr>
+          <w:sz w:val="20"/>
+        </w:rPr>
+        <w:t>Conexión correcta mediante PDO y resultado de la consulta a MySQL</w:t>
+      </w:r>
+    </w:p>
+    <w:p>
+      <w:pPr>
+        <w:spacing w:after="160" w:line="276" w:lineRule="auto"/>
+      </w:pPr>
+      <w:r>
+        <w:rPr>
+          <w:sz w:val="20"/>
+        </w:rPr>
+        <w:t>Captura real después de detener el servicio de base de datos. PHP continúa generando HTML y devuelve HTTP 503:</w:t>
+      </w:r>
+    </w:p>
+    <w:p>
+      <w:r>
+        <w:drawing>
+          <wp:inline>
+            <wp:extent cx="5400000" cy="4339286"/>
+            <wp:docPr id="4" name="Picture 4"/>
+            <wp:cNvGraphicFramePr>
+              <a:graphicFrameLocks noChangeAspect="1"/>
+            </wp:cNvGraphicFramePr>
+            <a:graphic>
+              <a:graphicData uri="http://schemas.openxmlformats.org/drawingml/2006/picture">
+                <pic:pic>
+                  <pic:nvPicPr>
+                    <pic:cNvPr id="0" name="error-conexion.png"/>
+                    <pic:cNvPicPr/>
+                  </pic:nvPicPr>
+                  <pic:blipFill>
+                    <a:blip r:embed="rId15"/>
+                    <a:stretch>
+                      <a:fillRect/>
+                    </a:stretch>
+                  </pic:blipFill>
+                  <pic:spPr>
+                    <a:xfrm>
+                      <a:off x="0" y="0"/>
+                      <a:ext cx="5400000" cy="4339286"/>
+                    </a:xfrm>
+                    <a:prstGeom prst="rect"/>
+                  </pic:spPr>
+                </pic:pic>
+              </a:graphicData>
+            </a:graphic>
+          </wp:inline>
+        </w:drawing>
+      </w:r>
+    </w:p>
+    <w:p>
+      <w:pPr>
+        <w:spacing w:after="160" w:line="276" w:lineRule="auto"/>
+      </w:pPr>
+      <w:r>
+        <w:rPr>
+          <w:sz w:val="20"/>
+        </w:rPr>
+        <w:t>Error de conexión gestionado por el bloque catch</w:t>
       </w:r>
     </w:p>
     <w:p>
@@ -1186,6 +1277,59 @@
         <w:keepNext/>
       </w:pPr>
       <w:r>
+        <w:t>Justificación frente a XAMPP</w:t>
+      </w:r>
+    </w:p>
+    <w:p>
+      <w:pPr>
+        <w:spacing w:after="160" w:line="276" w:lineRule="auto"/>
+      </w:pPr>
+      <w:r>
+        <w:rPr>
+          <w:sz w:val="20"/>
+        </w:rPr>
+        <w:t>Separar nginx, PHP y MySQL da a cada contenedor una responsabilidad. Se puede reconstruir la imagen PHP para añadir una extensión sin reinstalar MySQL, y conservar la base de datos mediante un volumen. La definición del entorno queda versionada junto con el código y puede compartirse con otro equipo.</w:t>
+      </w:r>
+    </w:p>
+    <w:p>
+      <w:pPr>
+        <w:spacing w:after="160" w:line="276" w:lineRule="auto"/>
+      </w:pPr>
+      <w:r>
+        <w:rPr>
+          <w:sz w:val="20"/>
+        </w:rPr>
+        <w:t>XAMPP simplifica la instalación inicial mediante un paquete integrado y un panel de control. Para una prueba pequeña puede requerir menos configuración. Su configuración local, las versiones instaladas y los cambios manuales no se reproducen únicamente al clonar el código del proyecto.</w:t>
+      </w:r>
+    </w:p>
+    <w:p>
+      <w:pPr>
+        <w:spacing w:after="160" w:line="276" w:lineRule="auto"/>
+      </w:pPr>
+      <w:r>
+        <w:rPr>
+          <w:sz w:val="20"/>
+        </w:rPr>
+        <w:t>Docker tiene límites: requiere aprender puertos, redes, imágenes y volúmenes; ocupa espacio con las imágenes y consume recursos del motor. En Windows, los contenedores Linux requieren una máquina virtual, normalmente mediante WSL 2. Los montajes de archivos pueden rendir de forma diferente según el sistema. Las etiquetas de imagen también pueden recibir actualizaciones; para reproducir exactamente sus bytes sería necesario fijar sus resúmenes de contenido (digests).</w:t>
+      </w:r>
+    </w:p>
+    <w:p>
+      <w:pPr>
+        <w:spacing w:after="160" w:line="276" w:lineRule="auto"/>
+      </w:pPr>
+      <w:r>
+        <w:rPr>
+          <w:sz w:val="20"/>
+        </w:rPr>
+        <w:t>Esta arquitectura resulta adecuada para aprender la separación de responsabilidades y reproducir un entorno de desarrollo. No garantiza por sí sola seguridad ni escalabilidad de producción: serían necesarios, entre otros ajustes, credenciales gestionadas fuera del repositorio, copias de seguridad y HTTPS.</w:t>
+      </w:r>
+    </w:p>
+    <w:p>
+      <w:pPr>
+        <w:pStyle w:val="Heading1"/>
+        <w:keepNext/>
+      </w:pPr>
+      <w:r>
         <w:t>Correspondencia con la rúbrica</w:t>
       </w:r>
     </w:p>
@@ -1252,7 +1396,7 @@
         <w:rPr>
           <w:sz w:val="20"/>
         </w:rPr>
-        <w:t>• RA1.g.3: README con instrucciones e historial de commits por etapas; publicación y captura pendientes de verificación.</w:t>
+        <w:t>• RA1.g.3: repositorio público, README con instrucciones y captura real e historial de commits por etapas.</w:t>
       </w:r>
     </w:p>
     <w:p>

</xml_diff>